<commit_message>
update project log book in references
</commit_message>
<xml_diff>
--- a/docs/references/PSM-Project-Log-Book-PSM.CU_.01.docx
+++ b/docs/references/PSM-Project-Log-Book-PSM.CU_.01.docx
@@ -430,17 +430,7 @@
           <w:szCs w:val="18"/>
           <w:lang w:val="en-MY"/>
         </w:rPr>
-        <w:t>D</w:t>
-      </w:r>
-      <w:r>
-        <w:rPr>
-          <w:rFonts w:ascii="Garamond" w:hAnsi="Garamond"/>
-          <w:color w:val="262626" w:themeColor="text1" w:themeTint="D9"/>
-          <w:sz w:val="28"/>
-          <w:szCs w:val="18"/>
-          <w:lang w:val="en-MY"/>
-        </w:rPr>
-        <w:t>ESIGN AND DEPLOYMENT OF A SECURE CLOUD-BASED PATIENT DATA MANAGEMENT SYSTEM USING A THREE-TIER ARCHITECTURE ON AWS</w:t>
+        <w:t>DESIGN AND DEPLOYMENT OF A SECURE CLOUD-BASED PATIENT DATA MANAGEMENT SYSTEM USING A THREE-TIER ARCHITECTURE ON AWS</w:t>
       </w:r>
     </w:p>
     <w:p>
@@ -2325,18 +2315,7 @@
                 <w:sz w:val="22"/>
                 <w:szCs w:val="24"/>
               </w:rPr>
-              <w:t>Stakeholder Analysis</w:t>
-            </w:r>
-            <w:r>
-              <w:rPr>
-                <w:b/>
-                <w:bCs/>
-                <w:color w:val="auto"/>
-                <w:kern w:val="0"/>
-                <w:sz w:val="22"/>
-                <w:szCs w:val="24"/>
-              </w:rPr>
-              <w:t>:</w:t>
+              <w:t>Stakeholder Analysis:</w:t>
             </w:r>
             <w:r>
               <w:rPr>
@@ -2385,18 +2364,7 @@
                 <w:sz w:val="22"/>
                 <w:szCs w:val="24"/>
               </w:rPr>
-              <w:t>Proposed Architecture</w:t>
-            </w:r>
-            <w:r>
-              <w:rPr>
-                <w:b/>
-                <w:bCs/>
-                <w:color w:val="auto"/>
-                <w:kern w:val="0"/>
-                <w:sz w:val="22"/>
-                <w:szCs w:val="24"/>
-              </w:rPr>
-              <w:t>:</w:t>
+              <w:t>Proposed Architecture:</w:t>
             </w:r>
             <w:r>
               <w:rPr>
@@ -7016,16 +6984,7 @@
                 <w:sz w:val="22"/>
                 <w:szCs w:val="24"/>
               </w:rPr>
-              <w:t>30</w:t>
-            </w:r>
-            <w:r>
-              <w:rPr>
-                <w:color w:val="auto"/>
-                <w:kern w:val="0"/>
-                <w:sz w:val="22"/>
-                <w:szCs w:val="24"/>
-              </w:rPr>
-              <w:t xml:space="preserve">/04/2026      </w:t>
+              <w:t xml:space="preserve">30/04/2026      </w:t>
             </w:r>
             <w:r>
               <w:rPr>
@@ -7222,16 +7181,7 @@
                 <w:sz w:val="22"/>
                 <w:szCs w:val="24"/>
               </w:rPr>
-              <w:t xml:space="preserve">: Finalized the Project Aim, Objectives, and Scope, </w:t>
-            </w:r>
-            <w:r>
-              <w:rPr>
-                <w:color w:val="auto"/>
-                <w:kern w:val="0"/>
-                <w:sz w:val="22"/>
-                <w:szCs w:val="24"/>
-              </w:rPr>
-              <w:t xml:space="preserve">ensuring </w:t>
+              <w:t xml:space="preserve">: Finalized the Project Aim, Objectives, and Scope, ensuring </w:t>
             </w:r>
             <w:r>
               <w:rPr>
@@ -7727,6 +7677,1855 @@
         </w:tc>
       </w:tr>
     </w:tbl>
+    <w:p/>
+    <w:p/>
+    <w:p/>
+    <w:p/>
+    <w:p/>
+    <w:p/>
+    <w:tbl>
+      <w:tblPr>
+        <w:tblW w:w="11164" w:type="dxa"/>
+        <w:tblInd w:w="-616" w:type="dxa"/>
+        <w:tblLayout w:type="fixed"/>
+        <w:tblLook w:val="0000" w:firstRow="0" w:lastRow="0" w:firstColumn="0" w:lastColumn="0" w:noHBand="0" w:noVBand="0"/>
+      </w:tblPr>
+      <w:tblGrid>
+        <w:gridCol w:w="2794"/>
+        <w:gridCol w:w="8370"/>
+      </w:tblGrid>
+      <w:tr>
+        <w:tc>
+          <w:tcPr>
+            <w:tcW w:w="2794" w:type="dxa"/>
+          </w:tcPr>
+          <w:p>
+            <w:pPr>
+              <w:spacing w:after="0" w:line="240" w:lineRule="auto"/>
+              <w:jc w:val="center"/>
+              <w:rPr>
+                <w:rFonts w:ascii="Book Antiqua" w:hAnsi="Book Antiqua"/>
+                <w:color w:val="auto"/>
+                <w:kern w:val="0"/>
+                <w:sz w:val="24"/>
+                <w:szCs w:val="24"/>
+              </w:rPr>
+            </w:pPr>
+            <w:r>
+              <w:rPr>
+                <w:b/>
+                <w:color w:val="auto"/>
+              </w:rPr>
+              <w:br w:type="page"/>
+            </w:r>
+            <w:r>
+              <w:rPr>
+                <w:rFonts w:ascii="Book Antiqua" w:hAnsi="Book Antiqua"/>
+                <w:noProof/>
+                <w:color w:val="auto"/>
+                <w:kern w:val="0"/>
+                <w:sz w:val="24"/>
+                <w:szCs w:val="24"/>
+                <w:lang w:val="ms-MY" w:eastAsia="ms-MY"/>
+              </w:rPr>
+              <w:drawing>
+                <wp:inline distT="0" distB="0" distL="0" distR="0" wp14:anchorId="57C91EB0" wp14:editId="59AB1AE8">
+                  <wp:extent cx="1365972" cy="552893"/>
+                  <wp:effectExtent l="19050" t="0" r="5628" b="0"/>
+                  <wp:docPr id="1316059637" name="Picture 0" descr="logo utm ru baru.jpg"/>
+                  <wp:cNvGraphicFramePr>
+                    <a:graphicFrameLocks xmlns:a="http://schemas.openxmlformats.org/drawingml/2006/main" noChangeAspect="1"/>
+                  </wp:cNvGraphicFramePr>
+                  <a:graphic xmlns:a="http://schemas.openxmlformats.org/drawingml/2006/main">
+                    <a:graphicData uri="http://schemas.openxmlformats.org/drawingml/2006/picture">
+                      <pic:pic xmlns:pic="http://schemas.openxmlformats.org/drawingml/2006/picture">
+                        <pic:nvPicPr>
+                          <pic:cNvPr id="0" name="logo utm ru baru.jpg"/>
+                          <pic:cNvPicPr/>
+                        </pic:nvPicPr>
+                        <pic:blipFill>
+                          <a:blip r:embed="rId7" cstate="print"/>
+                          <a:stretch>
+                            <a:fillRect/>
+                          </a:stretch>
+                        </pic:blipFill>
+                        <pic:spPr>
+                          <a:xfrm>
+                            <a:off x="0" y="0"/>
+                            <a:ext cx="1382983" cy="559778"/>
+                          </a:xfrm>
+                          <a:prstGeom prst="rect">
+                            <a:avLst/>
+                          </a:prstGeom>
+                        </pic:spPr>
+                      </pic:pic>
+                    </a:graphicData>
+                  </a:graphic>
+                </wp:inline>
+              </w:drawing>
+            </w:r>
+          </w:p>
+        </w:tc>
+        <w:tc>
+          <w:tcPr>
+            <w:tcW w:w="8370" w:type="dxa"/>
+            <w:vAlign w:val="center"/>
+          </w:tcPr>
+          <w:p>
+            <w:pPr>
+              <w:keepNext/>
+              <w:spacing w:after="0" w:line="240" w:lineRule="auto"/>
+              <w:ind w:left="1440"/>
+              <w:outlineLvl w:val="0"/>
+              <w:rPr>
+                <w:b/>
+                <w:bCs/>
+                <w:color w:val="auto"/>
+                <w:kern w:val="0"/>
+                <w:sz w:val="24"/>
+                <w:szCs w:val="24"/>
+                <w:lang w:val="sv-SE"/>
+              </w:rPr>
+            </w:pPr>
+            <w:r>
+              <w:rPr>
+                <w:b/>
+                <w:bCs/>
+                <w:color w:val="auto"/>
+                <w:kern w:val="0"/>
+                <w:sz w:val="24"/>
+                <w:szCs w:val="24"/>
+                <w:lang w:val="sv-SE"/>
+              </w:rPr>
+              <w:br/>
+            </w:r>
+            <w:r>
+              <w:rPr>
+                <w:b/>
+                <w:bCs/>
+                <w:color w:val="auto"/>
+                <w:kern w:val="0"/>
+                <w:sz w:val="24"/>
+                <w:szCs w:val="24"/>
+                <w:lang w:val="sv-SE"/>
+              </w:rPr>
+              <w:t xml:space="preserve">FACULTY OF </w:t>
+            </w:r>
+            <w:r>
+              <w:rPr>
+                <w:b/>
+                <w:bCs/>
+                <w:color w:val="auto"/>
+                <w:kern w:val="0"/>
+                <w:sz w:val="24"/>
+                <w:szCs w:val="24"/>
+                <w:lang w:val="sv-SE"/>
+              </w:rPr>
+              <w:t>COMPUTING</w:t>
+            </w:r>
+          </w:p>
+          <w:p>
+            <w:pPr>
+              <w:keepNext/>
+              <w:spacing w:after="0" w:line="240" w:lineRule="auto"/>
+              <w:ind w:left="1440"/>
+              <w:outlineLvl w:val="3"/>
+              <w:rPr>
+                <w:b/>
+                <w:bCs/>
+                <w:color w:val="auto"/>
+                <w:kern w:val="0"/>
+                <w:sz w:val="24"/>
+                <w:szCs w:val="24"/>
+                <w:lang w:val="sv-SE"/>
+              </w:rPr>
+            </w:pPr>
+            <w:r>
+              <w:rPr>
+                <w:b/>
+                <w:bCs/>
+                <w:color w:val="auto"/>
+                <w:kern w:val="0"/>
+                <w:sz w:val="24"/>
+                <w:szCs w:val="24"/>
+                <w:lang w:val="sv-SE"/>
+              </w:rPr>
+              <w:t>UNIVERSITI TEKNOLOGI MALAYSIA</w:t>
+            </w:r>
+          </w:p>
+          <w:p>
+            <w:pPr>
+              <w:keepNext/>
+              <w:spacing w:after="0" w:line="240" w:lineRule="auto"/>
+              <w:ind w:left="432"/>
+              <w:outlineLvl w:val="3"/>
+              <w:rPr>
+                <w:b/>
+                <w:bCs/>
+                <w:color w:val="auto"/>
+                <w:kern w:val="0"/>
+                <w:sz w:val="24"/>
+                <w:szCs w:val="24"/>
+                <w:lang w:val="sv-SE"/>
+              </w:rPr>
+            </w:pPr>
+          </w:p>
+          <w:p>
+            <w:pPr>
+              <w:keepNext/>
+              <w:spacing w:after="0" w:line="240" w:lineRule="auto"/>
+              <w:ind w:left="432"/>
+              <w:outlineLvl w:val="3"/>
+              <w:rPr>
+                <w:b/>
+                <w:bCs/>
+                <w:color w:val="auto"/>
+                <w:kern w:val="0"/>
+                <w:sz w:val="32"/>
+                <w:szCs w:val="24"/>
+                <w:lang w:val="sv-SE"/>
+              </w:rPr>
+            </w:pPr>
+            <w:r>
+              <w:rPr>
+                <w:b/>
+                <w:bCs/>
+                <w:color w:val="auto"/>
+                <w:kern w:val="0"/>
+                <w:sz w:val="32"/>
+                <w:szCs w:val="24"/>
+                <w:lang w:val="sv-SE"/>
+              </w:rPr>
+              <w:t xml:space="preserve">                      </w:t>
+            </w:r>
+            <w:r>
+              <w:rPr>
+                <w:b/>
+                <w:bCs/>
+                <w:color w:val="auto"/>
+                <w:kern w:val="0"/>
+                <w:sz w:val="32"/>
+                <w:szCs w:val="24"/>
+                <w:lang w:val="sv-SE"/>
+              </w:rPr>
+              <w:t>PSM LOG BOOK</w:t>
+            </w:r>
+          </w:p>
+          <w:p>
+            <w:pPr>
+              <w:keepNext/>
+              <w:spacing w:after="0" w:line="240" w:lineRule="auto"/>
+              <w:ind w:left="432"/>
+              <w:outlineLvl w:val="3"/>
+              <w:rPr>
+                <w:b/>
+                <w:bCs/>
+                <w:color w:val="auto"/>
+                <w:kern w:val="0"/>
+                <w:sz w:val="24"/>
+                <w:szCs w:val="24"/>
+                <w:lang w:val="sv-SE"/>
+              </w:rPr>
+            </w:pPr>
+          </w:p>
+          <w:p>
+            <w:pPr>
+              <w:spacing w:after="0"/>
+              <w:ind w:left="432"/>
+              <w:rPr>
+                <w:sz w:val="24"/>
+                <w:szCs w:val="22"/>
+              </w:rPr>
+            </w:pPr>
+            <w:r>
+              <w:rPr>
+                <w:b/>
+                <w:sz w:val="22"/>
+                <w:szCs w:val="22"/>
+              </w:rPr>
+              <w:t>SE</w:t>
+            </w:r>
+            <w:r>
+              <w:rPr>
+                <w:b/>
+                <w:sz w:val="22"/>
+                <w:szCs w:val="22"/>
+              </w:rPr>
+              <w:t>MESTER</w:t>
+            </w:r>
+            <w:r>
+              <w:rPr>
+                <w:sz w:val="22"/>
+                <w:szCs w:val="22"/>
+              </w:rPr>
+              <w:t xml:space="preserve">: </w:t>
+            </w:r>
+            <w:r>
+              <w:rPr>
+                <w:sz w:val="22"/>
+                <w:szCs w:val="22"/>
+              </w:rPr>
+              <w:t xml:space="preserve">20252026          </w:t>
+            </w:r>
+            <w:r>
+              <w:rPr>
+                <w:b/>
+                <w:sz w:val="22"/>
+                <w:szCs w:val="22"/>
+              </w:rPr>
+              <w:t>TYPE</w:t>
+            </w:r>
+            <w:r>
+              <w:rPr>
+                <w:sz w:val="22"/>
+                <w:szCs w:val="22"/>
+              </w:rPr>
+              <w:t xml:space="preserve">:  </w:t>
+            </w:r>
+            <w:r>
+              <w:rPr>
+                <w:sz w:val="24"/>
+                <w:szCs w:val="22"/>
+                <w:highlight w:val="yellow"/>
+              </w:rPr>
+              <w:t>PSM 1</w:t>
+            </w:r>
+            <w:r>
+              <w:rPr>
+                <w:sz w:val="24"/>
+                <w:szCs w:val="22"/>
+              </w:rPr>
+              <w:t xml:space="preserve"> / PSM 2</w:t>
+            </w:r>
+          </w:p>
+          <w:p>
+            <w:pPr>
+              <w:keepNext/>
+              <w:spacing w:after="0" w:line="240" w:lineRule="auto"/>
+              <w:outlineLvl w:val="3"/>
+              <w:rPr>
+                <w:b/>
+                <w:bCs/>
+                <w:color w:val="auto"/>
+                <w:kern w:val="0"/>
+                <w:sz w:val="24"/>
+                <w:szCs w:val="24"/>
+                <w:lang w:val="sv-SE"/>
+              </w:rPr>
+            </w:pPr>
+          </w:p>
+        </w:tc>
+      </w:tr>
+    </w:tbl>
+    <w:p>
+      <w:pPr>
+        <w:spacing w:after="0"/>
+        <w:jc w:val="both"/>
+        <w:rPr>
+          <w:sz w:val="22"/>
+          <w:szCs w:val="22"/>
+        </w:rPr>
+      </w:pPr>
+    </w:p>
+    <w:tbl>
+      <w:tblPr>
+        <w:tblW w:w="9738" w:type="dxa"/>
+        <w:tblLayout w:type="fixed"/>
+        <w:tblLook w:val="0000" w:firstRow="0" w:lastRow="0" w:firstColumn="0" w:lastColumn="0" w:noHBand="0" w:noVBand="0"/>
+      </w:tblPr>
+      <w:tblGrid>
+        <w:gridCol w:w="2072"/>
+        <w:gridCol w:w="7666"/>
+      </w:tblGrid>
+      <w:tr>
+        <w:tc>
+          <w:tcPr>
+            <w:tcW w:w="2072" w:type="dxa"/>
+          </w:tcPr>
+          <w:p>
+            <w:pPr>
+              <w:spacing w:after="0" w:line="360" w:lineRule="auto"/>
+              <w:jc w:val="both"/>
+              <w:rPr>
+                <w:b/>
+                <w:color w:val="auto"/>
+                <w:kern w:val="0"/>
+                <w:sz w:val="22"/>
+                <w:szCs w:val="24"/>
+              </w:rPr>
+            </w:pPr>
+            <w:r>
+              <w:rPr>
+                <w:b/>
+                <w:color w:val="auto"/>
+                <w:kern w:val="0"/>
+                <w:sz w:val="22"/>
+                <w:szCs w:val="24"/>
+              </w:rPr>
+              <w:t>Date</w:t>
+            </w:r>
+          </w:p>
+        </w:tc>
+        <w:tc>
+          <w:tcPr>
+            <w:tcW w:w="7666" w:type="dxa"/>
+          </w:tcPr>
+          <w:p>
+            <w:pPr>
+              <w:spacing w:after="0" w:line="360" w:lineRule="auto"/>
+              <w:jc w:val="both"/>
+              <w:rPr>
+                <w:color w:val="auto"/>
+                <w:kern w:val="0"/>
+                <w:sz w:val="24"/>
+                <w:szCs w:val="24"/>
+              </w:rPr>
+            </w:pPr>
+            <w:r>
+              <w:rPr>
+                <w:b/>
+                <w:bCs/>
+                <w:color w:val="auto"/>
+                <w:kern w:val="0"/>
+                <w:sz w:val="22"/>
+                <w:szCs w:val="24"/>
+              </w:rPr>
+              <w:t>:</w:t>
+            </w:r>
+            <w:r>
+              <w:rPr>
+                <w:color w:val="auto"/>
+                <w:kern w:val="0"/>
+                <w:sz w:val="22"/>
+                <w:szCs w:val="24"/>
+              </w:rPr>
+              <w:t>15</w:t>
+            </w:r>
+            <w:r>
+              <w:rPr>
+                <w:color w:val="auto"/>
+                <w:kern w:val="0"/>
+                <w:sz w:val="22"/>
+                <w:szCs w:val="24"/>
+              </w:rPr>
+              <w:t>/0</w:t>
+            </w:r>
+            <w:r>
+              <w:rPr>
+                <w:color w:val="auto"/>
+                <w:kern w:val="0"/>
+                <w:sz w:val="22"/>
+                <w:szCs w:val="24"/>
+              </w:rPr>
+              <w:t>5</w:t>
+            </w:r>
+            <w:r>
+              <w:rPr>
+                <w:color w:val="auto"/>
+                <w:kern w:val="0"/>
+                <w:sz w:val="22"/>
+                <w:szCs w:val="24"/>
+              </w:rPr>
+              <w:t xml:space="preserve">/2026      </w:t>
+            </w:r>
+            <w:r>
+              <w:rPr>
+                <w:b/>
+                <w:color w:val="auto"/>
+                <w:kern w:val="0"/>
+                <w:sz w:val="22"/>
+                <w:szCs w:val="24"/>
+              </w:rPr>
+              <w:t>Meeting:</w:t>
+            </w:r>
+            <w:r>
+              <w:rPr>
+                <w:color w:val="auto"/>
+                <w:kern w:val="0"/>
+                <w:sz w:val="22"/>
+                <w:szCs w:val="24"/>
+              </w:rPr>
+              <w:t xml:space="preserve">  </w:t>
+            </w:r>
+            <w:r>
+              <w:rPr>
+                <w:color w:val="auto"/>
+                <w:kern w:val="0"/>
+                <w:sz w:val="24"/>
+                <w:szCs w:val="24"/>
+              </w:rPr>
+              <w:t xml:space="preserve">1 / 2 / 3 / </w:t>
+            </w:r>
+            <w:r>
+              <w:rPr>
+                <w:color w:val="auto"/>
+                <w:kern w:val="0"/>
+                <w:sz w:val="24"/>
+                <w:szCs w:val="24"/>
+              </w:rPr>
+              <w:t>4</w:t>
+            </w:r>
+            <w:r>
+              <w:rPr>
+                <w:color w:val="auto"/>
+                <w:kern w:val="0"/>
+                <w:sz w:val="24"/>
+                <w:szCs w:val="24"/>
+              </w:rPr>
+              <w:t xml:space="preserve"> / </w:t>
+            </w:r>
+            <w:r>
+              <w:rPr>
+                <w:color w:val="auto"/>
+                <w:kern w:val="0"/>
+                <w:sz w:val="24"/>
+                <w:szCs w:val="24"/>
+              </w:rPr>
+              <w:t>5</w:t>
+            </w:r>
+            <w:r>
+              <w:rPr>
+                <w:color w:val="auto"/>
+                <w:kern w:val="0"/>
+                <w:sz w:val="24"/>
+                <w:szCs w:val="24"/>
+              </w:rPr>
+              <w:t xml:space="preserve">/ </w:t>
+            </w:r>
+            <w:r>
+              <w:rPr>
+                <w:color w:val="auto"/>
+                <w:kern w:val="0"/>
+                <w:sz w:val="24"/>
+                <w:szCs w:val="24"/>
+                <w:highlight w:val="yellow"/>
+              </w:rPr>
+              <w:t>6</w:t>
+            </w:r>
+            <w:r>
+              <w:rPr>
+                <w:color w:val="auto"/>
+                <w:kern w:val="0"/>
+                <w:sz w:val="24"/>
+                <w:szCs w:val="24"/>
+              </w:rPr>
+              <w:t xml:space="preserve"> / 7 ……</w:t>
+            </w:r>
+          </w:p>
+          <w:p>
+            <w:pPr>
+              <w:spacing w:after="0" w:line="360" w:lineRule="auto"/>
+              <w:jc w:val="both"/>
+              <w:rPr>
+                <w:color w:val="auto"/>
+                <w:kern w:val="0"/>
+                <w:sz w:val="22"/>
+                <w:szCs w:val="24"/>
+              </w:rPr>
+            </w:pPr>
+          </w:p>
+        </w:tc>
+      </w:tr>
+      <w:tr>
+        <w:tc>
+          <w:tcPr>
+            <w:tcW w:w="2072" w:type="dxa"/>
+          </w:tcPr>
+          <w:p>
+            <w:pPr>
+              <w:spacing w:after="0"/>
+              <w:rPr>
+                <w:b/>
+              </w:rPr>
+            </w:pPr>
+            <w:r>
+              <w:rPr>
+                <w:b/>
+              </w:rPr>
+              <w:t>Student</w:t>
+            </w:r>
+          </w:p>
+          <w:p>
+            <w:pPr>
+              <w:spacing w:after="0" w:line="240" w:lineRule="auto"/>
+              <w:jc w:val="both"/>
+              <w:rPr>
+                <w:b/>
+              </w:rPr>
+            </w:pPr>
+            <w:r>
+              <w:rPr>
+                <w:b/>
+              </w:rPr>
+              <w:t>(Meeting Minute/</w:t>
+            </w:r>
+          </w:p>
+          <w:p>
+            <w:pPr>
+              <w:spacing w:after="0" w:line="240" w:lineRule="auto"/>
+              <w:jc w:val="both"/>
+              <w:rPr>
+                <w:b/>
+              </w:rPr>
+            </w:pPr>
+            <w:r>
+              <w:rPr>
+                <w:b/>
+              </w:rPr>
+              <w:t>Achievements/</w:t>
+            </w:r>
+          </w:p>
+          <w:p>
+            <w:pPr>
+              <w:spacing w:after="0" w:line="240" w:lineRule="auto"/>
+              <w:jc w:val="both"/>
+              <w:rPr>
+                <w:color w:val="auto"/>
+                <w:kern w:val="0"/>
+                <w:sz w:val="22"/>
+                <w:szCs w:val="24"/>
+              </w:rPr>
+            </w:pPr>
+            <w:r>
+              <w:rPr>
+                <w:b/>
+              </w:rPr>
+              <w:t>Activities</w:t>
+            </w:r>
+            <w:r>
+              <w:rPr>
+                <w:b/>
+              </w:rPr>
+              <w:t>)</w:t>
+            </w:r>
+          </w:p>
+        </w:tc>
+        <w:tc>
+          <w:tcPr>
+            <w:tcW w:w="7666" w:type="dxa"/>
+          </w:tcPr>
+          <w:p>
+            <w:pPr>
+              <w:spacing w:after="0" w:line="360" w:lineRule="auto"/>
+              <w:rPr>
+                <w:color w:val="auto"/>
+                <w:kern w:val="0"/>
+                <w:sz w:val="22"/>
+                <w:szCs w:val="24"/>
+              </w:rPr>
+            </w:pPr>
+            <w:r>
+              <w:rPr>
+                <w:color w:val="auto"/>
+                <w:kern w:val="0"/>
+                <w:sz w:val="22"/>
+                <w:szCs w:val="24"/>
+              </w:rPr>
+              <w:t xml:space="preserve">: </w:t>
+            </w:r>
+            <w:r>
+              <w:t>Presented the methodology chapter draft to supervisor. Completed the justification for selecting Agile with DevSecOps over Waterfall and Scrum methodologies, supported with comparison table. Defined the five-sprint structure with security gates for each sprint. Completed the technology stack description covering AWS services, Terraform, Docker, GitHub Actions, Trivy, SonarQube, and Checkov. Completed functional requirements (FR-01 to FR-12) and non-functional requirements (NFR-01 to NFR-11) with verification methods. Completed minimum client-side and server-side requirements tables.</w:t>
+            </w:r>
+            <w:r>
+              <w:rPr>
+                <w:color w:val="auto"/>
+                <w:kern w:val="0"/>
+                <w:sz w:val="22"/>
+                <w:szCs w:val="24"/>
+              </w:rPr>
+              <w:t xml:space="preserve"> </w:t>
+            </w:r>
+          </w:p>
+          <w:p>
+            <w:pPr>
+              <w:spacing w:after="0" w:line="360" w:lineRule="auto"/>
+              <w:rPr>
+                <w:color w:val="auto"/>
+                <w:kern w:val="0"/>
+                <w:sz w:val="22"/>
+                <w:szCs w:val="24"/>
+              </w:rPr>
+            </w:pPr>
+          </w:p>
+        </w:tc>
+      </w:tr>
+      <w:tr>
+        <w:tc>
+          <w:tcPr>
+            <w:tcW w:w="2072" w:type="dxa"/>
+          </w:tcPr>
+          <w:p>
+            <w:pPr>
+              <w:spacing w:after="0"/>
+              <w:rPr>
+                <w:b/>
+              </w:rPr>
+            </w:pPr>
+            <w:r>
+              <w:rPr>
+                <w:b/>
+              </w:rPr>
+              <w:t>Supervisor</w:t>
+            </w:r>
+          </w:p>
+          <w:p>
+            <w:pPr>
+              <w:spacing w:after="0" w:line="240" w:lineRule="auto"/>
+              <w:jc w:val="both"/>
+              <w:rPr>
+                <w:b/>
+                <w:color w:val="auto"/>
+                <w:kern w:val="0"/>
+                <w:sz w:val="22"/>
+                <w:szCs w:val="24"/>
+              </w:rPr>
+            </w:pPr>
+            <w:r>
+              <w:rPr>
+                <w:b/>
+              </w:rPr>
+              <w:t>(Suggestion&amp; Comments)</w:t>
+            </w:r>
+          </w:p>
+          <w:p>
+            <w:pPr>
+              <w:spacing w:after="0" w:line="360" w:lineRule="auto"/>
+              <w:jc w:val="both"/>
+              <w:rPr>
+                <w:color w:val="auto"/>
+                <w:kern w:val="0"/>
+                <w:sz w:val="22"/>
+                <w:szCs w:val="24"/>
+              </w:rPr>
+            </w:pPr>
+          </w:p>
+          <w:p>
+            <w:pPr>
+              <w:spacing w:after="0" w:line="360" w:lineRule="auto"/>
+              <w:jc w:val="both"/>
+              <w:rPr>
+                <w:color w:val="auto"/>
+                <w:kern w:val="0"/>
+                <w:sz w:val="22"/>
+                <w:szCs w:val="24"/>
+              </w:rPr>
+            </w:pPr>
+          </w:p>
+          <w:p>
+            <w:pPr>
+              <w:spacing w:after="0" w:line="360" w:lineRule="auto"/>
+              <w:jc w:val="both"/>
+              <w:rPr>
+                <w:color w:val="auto"/>
+                <w:kern w:val="0"/>
+                <w:sz w:val="22"/>
+                <w:szCs w:val="24"/>
+              </w:rPr>
+            </w:pPr>
+          </w:p>
+        </w:tc>
+        <w:tc>
+          <w:tcPr>
+            <w:tcW w:w="7666" w:type="dxa"/>
+          </w:tcPr>
+          <w:p>
+            <w:pPr>
+              <w:spacing w:after="0" w:line="360" w:lineRule="auto"/>
+              <w:jc w:val="both"/>
+            </w:pPr>
+            <w:r>
+              <w:rPr>
+                <w:color w:val="auto"/>
+                <w:kern w:val="0"/>
+                <w:sz w:val="22"/>
+                <w:szCs w:val="24"/>
+              </w:rPr>
+              <w:t xml:space="preserve">: </w:t>
+            </w:r>
+            <w:r>
+              <w:t>Methodology justification is well-structured and clearly argued. Suggested ensuring that each sprint's security gate is measurable and tied to a specific tool output. Recommended adding a requirements traceability diagram to link functional requirements back to the identified system vulnerabilities from Chapter 2. Noted that the technology descriptions should reference relevant literature where possible.</w:t>
+            </w:r>
+          </w:p>
+          <w:p>
+            <w:pPr>
+              <w:spacing w:after="0" w:line="360" w:lineRule="auto"/>
+              <w:jc w:val="both"/>
+              <w:rPr>
+                <w:color w:val="auto"/>
+                <w:kern w:val="0"/>
+                <w:sz w:val="22"/>
+                <w:szCs w:val="24"/>
+              </w:rPr>
+            </w:pPr>
+          </w:p>
+        </w:tc>
+      </w:tr>
+      <w:tr>
+        <w:tc>
+          <w:tcPr>
+            <w:tcW w:w="2072" w:type="dxa"/>
+          </w:tcPr>
+          <w:p>
+            <w:pPr>
+              <w:spacing w:after="0" w:line="240" w:lineRule="auto"/>
+              <w:rPr>
+                <w:b/>
+              </w:rPr>
+            </w:pPr>
+            <w:r>
+              <w:rPr>
+                <w:b/>
+              </w:rPr>
+              <w:t>Next Meeting</w:t>
+            </w:r>
+          </w:p>
+          <w:p>
+            <w:pPr>
+              <w:spacing w:after="0" w:line="240" w:lineRule="auto"/>
+              <w:rPr>
+                <w:b/>
+              </w:rPr>
+            </w:pPr>
+            <w:r>
+              <w:rPr>
+                <w:b/>
+              </w:rPr>
+              <w:t>Plan</w:t>
+            </w:r>
+          </w:p>
+        </w:tc>
+        <w:tc>
+          <w:tcPr>
+            <w:tcW w:w="7666" w:type="dxa"/>
+          </w:tcPr>
+          <w:p>
+            <w:pPr>
+              <w:spacing w:after="0" w:line="360" w:lineRule="auto"/>
+              <w:rPr>
+                <w:color w:val="auto"/>
+                <w:kern w:val="0"/>
+                <w:sz w:val="22"/>
+                <w:szCs w:val="24"/>
+              </w:rPr>
+            </w:pPr>
+            <w:r>
+              <w:rPr>
+                <w:color w:val="auto"/>
+                <w:kern w:val="0"/>
+                <w:sz w:val="22"/>
+                <w:szCs w:val="24"/>
+              </w:rPr>
+              <w:t xml:space="preserve">: </w:t>
+            </w:r>
+            <w:r>
+              <w:t>Present Chapter 4 draft covering system architecture design, VPC network topology, and security group configuration. Begin use case analysis and user story documentation.</w:t>
+            </w:r>
+          </w:p>
+        </w:tc>
+      </w:tr>
+      <w:tr>
+        <w:tc>
+          <w:tcPr>
+            <w:tcW w:w="2072" w:type="dxa"/>
+          </w:tcPr>
+          <w:p>
+            <w:pPr>
+              <w:spacing w:after="0" w:line="240" w:lineRule="auto"/>
+              <w:jc w:val="both"/>
+              <w:rPr>
+                <w:b/>
+                <w:color w:val="auto"/>
+                <w:kern w:val="0"/>
+                <w:sz w:val="22"/>
+                <w:szCs w:val="24"/>
+              </w:rPr>
+            </w:pPr>
+          </w:p>
+          <w:p>
+            <w:pPr>
+              <w:spacing w:after="0" w:line="240" w:lineRule="auto"/>
+              <w:jc w:val="both"/>
+            </w:pPr>
+            <w:r>
+              <w:rPr>
+                <w:b/>
+                <w:color w:val="auto"/>
+                <w:kern w:val="0"/>
+                <w:sz w:val="22"/>
+                <w:szCs w:val="24"/>
+              </w:rPr>
+              <w:t>Supervisor’s Signature</w:t>
+            </w:r>
+          </w:p>
+        </w:tc>
+        <w:tc>
+          <w:tcPr>
+            <w:tcW w:w="7666" w:type="dxa"/>
+          </w:tcPr>
+          <w:p>
+            <w:pPr>
+              <w:spacing w:after="0" w:line="360" w:lineRule="auto"/>
+              <w:jc w:val="both"/>
+              <w:rPr>
+                <w:color w:val="auto"/>
+                <w:kern w:val="0"/>
+                <w:sz w:val="22"/>
+                <w:szCs w:val="24"/>
+              </w:rPr>
+            </w:pPr>
+          </w:p>
+          <w:p>
+            <w:pPr>
+              <w:spacing w:after="0" w:line="360" w:lineRule="auto"/>
+              <w:jc w:val="both"/>
+              <w:rPr>
+                <w:color w:val="auto"/>
+                <w:kern w:val="0"/>
+                <w:sz w:val="22"/>
+                <w:szCs w:val="24"/>
+              </w:rPr>
+            </w:pPr>
+          </w:p>
+          <w:p>
+            <w:pPr>
+              <w:spacing w:after="0" w:line="360" w:lineRule="auto"/>
+              <w:jc w:val="both"/>
+              <w:rPr>
+                <w:color w:val="auto"/>
+                <w:kern w:val="0"/>
+                <w:sz w:val="22"/>
+                <w:szCs w:val="24"/>
+              </w:rPr>
+            </w:pPr>
+            <w:r>
+              <w:rPr>
+                <w:color w:val="auto"/>
+                <w:kern w:val="0"/>
+                <w:sz w:val="22"/>
+                <w:szCs w:val="24"/>
+              </w:rPr>
+              <w:t>……………………….     Date: …………………</w:t>
+            </w:r>
+          </w:p>
+        </w:tc>
+      </w:tr>
+    </w:tbl>
+    <w:p/>
+    <w:p/>
+    <w:tbl>
+      <w:tblPr>
+        <w:tblW w:w="11164" w:type="dxa"/>
+        <w:tblInd w:w="-616" w:type="dxa"/>
+        <w:tblLayout w:type="fixed"/>
+        <w:tblLook w:val="0000" w:firstRow="0" w:lastRow="0" w:firstColumn="0" w:lastColumn="0" w:noHBand="0" w:noVBand="0"/>
+      </w:tblPr>
+      <w:tblGrid>
+        <w:gridCol w:w="2794"/>
+        <w:gridCol w:w="8370"/>
+      </w:tblGrid>
+      <w:tr>
+        <w:tc>
+          <w:tcPr>
+            <w:tcW w:w="2794" w:type="dxa"/>
+          </w:tcPr>
+          <w:p>
+            <w:pPr>
+              <w:spacing w:after="0" w:line="240" w:lineRule="auto"/>
+              <w:jc w:val="center"/>
+              <w:rPr>
+                <w:rFonts w:ascii="Book Antiqua" w:hAnsi="Book Antiqua"/>
+                <w:color w:val="auto"/>
+                <w:kern w:val="0"/>
+                <w:sz w:val="24"/>
+                <w:szCs w:val="24"/>
+              </w:rPr>
+            </w:pPr>
+            <w:r>
+              <w:rPr>
+                <w:b/>
+                <w:color w:val="auto"/>
+              </w:rPr>
+              <w:lastRenderedPageBreak/>
+              <w:br w:type="page"/>
+            </w:r>
+            <w:r>
+              <w:rPr>
+                <w:rFonts w:ascii="Book Antiqua" w:hAnsi="Book Antiqua"/>
+                <w:noProof/>
+                <w:color w:val="auto"/>
+                <w:kern w:val="0"/>
+                <w:sz w:val="24"/>
+                <w:szCs w:val="24"/>
+                <w:lang w:val="ms-MY" w:eastAsia="ms-MY"/>
+              </w:rPr>
+              <w:drawing>
+                <wp:inline distT="0" distB="0" distL="0" distR="0" wp14:anchorId="75EC721F" wp14:editId="0AE303B4">
+                  <wp:extent cx="1365972" cy="552893"/>
+                  <wp:effectExtent l="19050" t="0" r="5628" b="0"/>
+                  <wp:docPr id="224910868" name="Picture 0" descr="logo utm ru baru.jpg"/>
+                  <wp:cNvGraphicFramePr>
+                    <a:graphicFrameLocks xmlns:a="http://schemas.openxmlformats.org/drawingml/2006/main" noChangeAspect="1"/>
+                  </wp:cNvGraphicFramePr>
+                  <a:graphic xmlns:a="http://schemas.openxmlformats.org/drawingml/2006/main">
+                    <a:graphicData uri="http://schemas.openxmlformats.org/drawingml/2006/picture">
+                      <pic:pic xmlns:pic="http://schemas.openxmlformats.org/drawingml/2006/picture">
+                        <pic:nvPicPr>
+                          <pic:cNvPr id="0" name="logo utm ru baru.jpg"/>
+                          <pic:cNvPicPr/>
+                        </pic:nvPicPr>
+                        <pic:blipFill>
+                          <a:blip r:embed="rId7" cstate="print"/>
+                          <a:stretch>
+                            <a:fillRect/>
+                          </a:stretch>
+                        </pic:blipFill>
+                        <pic:spPr>
+                          <a:xfrm>
+                            <a:off x="0" y="0"/>
+                            <a:ext cx="1382983" cy="559778"/>
+                          </a:xfrm>
+                          <a:prstGeom prst="rect">
+                            <a:avLst/>
+                          </a:prstGeom>
+                        </pic:spPr>
+                      </pic:pic>
+                    </a:graphicData>
+                  </a:graphic>
+                </wp:inline>
+              </w:drawing>
+            </w:r>
+          </w:p>
+        </w:tc>
+        <w:tc>
+          <w:tcPr>
+            <w:tcW w:w="8370" w:type="dxa"/>
+            <w:vAlign w:val="center"/>
+          </w:tcPr>
+          <w:p>
+            <w:pPr>
+              <w:keepNext/>
+              <w:spacing w:after="0" w:line="240" w:lineRule="auto"/>
+              <w:ind w:left="1440"/>
+              <w:outlineLvl w:val="0"/>
+              <w:rPr>
+                <w:b/>
+                <w:bCs/>
+                <w:color w:val="auto"/>
+                <w:kern w:val="0"/>
+                <w:sz w:val="24"/>
+                <w:szCs w:val="24"/>
+                <w:lang w:val="sv-SE"/>
+              </w:rPr>
+            </w:pPr>
+            <w:r>
+              <w:rPr>
+                <w:b/>
+                <w:bCs/>
+                <w:color w:val="auto"/>
+                <w:kern w:val="0"/>
+                <w:sz w:val="24"/>
+                <w:szCs w:val="24"/>
+                <w:lang w:val="sv-SE"/>
+              </w:rPr>
+              <w:br/>
+            </w:r>
+            <w:r>
+              <w:rPr>
+                <w:b/>
+                <w:bCs/>
+                <w:color w:val="auto"/>
+                <w:kern w:val="0"/>
+                <w:sz w:val="24"/>
+                <w:szCs w:val="24"/>
+                <w:lang w:val="sv-SE"/>
+              </w:rPr>
+              <w:t xml:space="preserve">FACULTY OF </w:t>
+            </w:r>
+            <w:r>
+              <w:rPr>
+                <w:b/>
+                <w:bCs/>
+                <w:color w:val="auto"/>
+                <w:kern w:val="0"/>
+                <w:sz w:val="24"/>
+                <w:szCs w:val="24"/>
+                <w:lang w:val="sv-SE"/>
+              </w:rPr>
+              <w:t>COMPUTING</w:t>
+            </w:r>
+          </w:p>
+          <w:p>
+            <w:pPr>
+              <w:keepNext/>
+              <w:spacing w:after="0" w:line="240" w:lineRule="auto"/>
+              <w:ind w:left="1440"/>
+              <w:outlineLvl w:val="3"/>
+              <w:rPr>
+                <w:b/>
+                <w:bCs/>
+                <w:color w:val="auto"/>
+                <w:kern w:val="0"/>
+                <w:sz w:val="24"/>
+                <w:szCs w:val="24"/>
+                <w:lang w:val="sv-SE"/>
+              </w:rPr>
+            </w:pPr>
+            <w:r>
+              <w:rPr>
+                <w:b/>
+                <w:bCs/>
+                <w:color w:val="auto"/>
+                <w:kern w:val="0"/>
+                <w:sz w:val="24"/>
+                <w:szCs w:val="24"/>
+                <w:lang w:val="sv-SE"/>
+              </w:rPr>
+              <w:t>UNIVERSITI TEKNOLOGI MALAYSIA</w:t>
+            </w:r>
+          </w:p>
+          <w:p>
+            <w:pPr>
+              <w:keepNext/>
+              <w:spacing w:after="0" w:line="240" w:lineRule="auto"/>
+              <w:ind w:left="432"/>
+              <w:outlineLvl w:val="3"/>
+              <w:rPr>
+                <w:b/>
+                <w:bCs/>
+                <w:color w:val="auto"/>
+                <w:kern w:val="0"/>
+                <w:sz w:val="24"/>
+                <w:szCs w:val="24"/>
+                <w:lang w:val="sv-SE"/>
+              </w:rPr>
+            </w:pPr>
+          </w:p>
+          <w:p>
+            <w:pPr>
+              <w:keepNext/>
+              <w:spacing w:after="0" w:line="240" w:lineRule="auto"/>
+              <w:ind w:left="432"/>
+              <w:outlineLvl w:val="3"/>
+              <w:rPr>
+                <w:b/>
+                <w:bCs/>
+                <w:color w:val="auto"/>
+                <w:kern w:val="0"/>
+                <w:sz w:val="32"/>
+                <w:szCs w:val="24"/>
+                <w:lang w:val="sv-SE"/>
+              </w:rPr>
+            </w:pPr>
+            <w:r>
+              <w:rPr>
+                <w:b/>
+                <w:bCs/>
+                <w:color w:val="auto"/>
+                <w:kern w:val="0"/>
+                <w:sz w:val="32"/>
+                <w:szCs w:val="24"/>
+                <w:lang w:val="sv-SE"/>
+              </w:rPr>
+              <w:t xml:space="preserve">                      </w:t>
+            </w:r>
+            <w:r>
+              <w:rPr>
+                <w:b/>
+                <w:bCs/>
+                <w:color w:val="auto"/>
+                <w:kern w:val="0"/>
+                <w:sz w:val="32"/>
+                <w:szCs w:val="24"/>
+                <w:lang w:val="sv-SE"/>
+              </w:rPr>
+              <w:t>PSM LOG BOOK</w:t>
+            </w:r>
+          </w:p>
+          <w:p>
+            <w:pPr>
+              <w:keepNext/>
+              <w:spacing w:after="0" w:line="240" w:lineRule="auto"/>
+              <w:ind w:left="432"/>
+              <w:outlineLvl w:val="3"/>
+              <w:rPr>
+                <w:b/>
+                <w:bCs/>
+                <w:color w:val="auto"/>
+                <w:kern w:val="0"/>
+                <w:sz w:val="24"/>
+                <w:szCs w:val="24"/>
+                <w:lang w:val="sv-SE"/>
+              </w:rPr>
+            </w:pPr>
+          </w:p>
+          <w:p>
+            <w:pPr>
+              <w:spacing w:after="0"/>
+              <w:ind w:left="432"/>
+              <w:rPr>
+                <w:sz w:val="24"/>
+                <w:szCs w:val="22"/>
+              </w:rPr>
+            </w:pPr>
+            <w:r>
+              <w:rPr>
+                <w:b/>
+                <w:sz w:val="22"/>
+                <w:szCs w:val="22"/>
+              </w:rPr>
+              <w:t>SE</w:t>
+            </w:r>
+            <w:r>
+              <w:rPr>
+                <w:b/>
+                <w:sz w:val="22"/>
+                <w:szCs w:val="22"/>
+              </w:rPr>
+              <w:t>MESTER</w:t>
+            </w:r>
+            <w:r>
+              <w:rPr>
+                <w:sz w:val="22"/>
+                <w:szCs w:val="22"/>
+              </w:rPr>
+              <w:t xml:space="preserve">: </w:t>
+            </w:r>
+            <w:r>
+              <w:rPr>
+                <w:sz w:val="22"/>
+                <w:szCs w:val="22"/>
+              </w:rPr>
+              <w:t xml:space="preserve">20252026          </w:t>
+            </w:r>
+            <w:proofErr w:type="gramStart"/>
+            <w:r>
+              <w:rPr>
+                <w:b/>
+                <w:sz w:val="22"/>
+                <w:szCs w:val="22"/>
+              </w:rPr>
+              <w:t>TYPE</w:t>
+            </w:r>
+            <w:proofErr w:type="gramEnd"/>
+            <w:r>
+              <w:rPr>
+                <w:sz w:val="22"/>
+                <w:szCs w:val="22"/>
+              </w:rPr>
+              <w:t xml:space="preserve">:  </w:t>
+            </w:r>
+            <w:r>
+              <w:rPr>
+                <w:sz w:val="24"/>
+                <w:szCs w:val="22"/>
+                <w:highlight w:val="yellow"/>
+              </w:rPr>
+              <w:t>PSM 1</w:t>
+            </w:r>
+            <w:r>
+              <w:rPr>
+                <w:sz w:val="24"/>
+                <w:szCs w:val="22"/>
+              </w:rPr>
+              <w:t xml:space="preserve"> / PSM 2</w:t>
+            </w:r>
+          </w:p>
+          <w:p>
+            <w:pPr>
+              <w:keepNext/>
+              <w:spacing w:after="0" w:line="240" w:lineRule="auto"/>
+              <w:outlineLvl w:val="3"/>
+              <w:rPr>
+                <w:b/>
+                <w:bCs/>
+                <w:color w:val="auto"/>
+                <w:kern w:val="0"/>
+                <w:sz w:val="24"/>
+                <w:szCs w:val="24"/>
+                <w:lang w:val="sv-SE"/>
+              </w:rPr>
+            </w:pPr>
+          </w:p>
+        </w:tc>
+      </w:tr>
+    </w:tbl>
+    <w:p>
+      <w:pPr>
+        <w:spacing w:after="0"/>
+        <w:jc w:val="both"/>
+        <w:rPr>
+          <w:sz w:val="22"/>
+          <w:szCs w:val="22"/>
+        </w:rPr>
+      </w:pPr>
+    </w:p>
+    <w:tbl>
+      <w:tblPr>
+        <w:tblW w:w="9738" w:type="dxa"/>
+        <w:tblLayout w:type="fixed"/>
+        <w:tblLook w:val="0000" w:firstRow="0" w:lastRow="0" w:firstColumn="0" w:lastColumn="0" w:noHBand="0" w:noVBand="0"/>
+      </w:tblPr>
+      <w:tblGrid>
+        <w:gridCol w:w="2072"/>
+        <w:gridCol w:w="7666"/>
+      </w:tblGrid>
+      <w:tr>
+        <w:tc>
+          <w:tcPr>
+            <w:tcW w:w="2072" w:type="dxa"/>
+          </w:tcPr>
+          <w:p>
+            <w:pPr>
+              <w:spacing w:after="0" w:line="360" w:lineRule="auto"/>
+              <w:jc w:val="both"/>
+              <w:rPr>
+                <w:b/>
+                <w:color w:val="auto"/>
+                <w:kern w:val="0"/>
+                <w:sz w:val="22"/>
+                <w:szCs w:val="24"/>
+              </w:rPr>
+            </w:pPr>
+            <w:r>
+              <w:rPr>
+                <w:b/>
+                <w:color w:val="auto"/>
+                <w:kern w:val="0"/>
+                <w:sz w:val="22"/>
+                <w:szCs w:val="24"/>
+              </w:rPr>
+              <w:t>Date</w:t>
+            </w:r>
+          </w:p>
+        </w:tc>
+        <w:tc>
+          <w:tcPr>
+            <w:tcW w:w="7666" w:type="dxa"/>
+          </w:tcPr>
+          <w:p>
+            <w:pPr>
+              <w:spacing w:after="0" w:line="360" w:lineRule="auto"/>
+              <w:jc w:val="both"/>
+              <w:rPr>
+                <w:color w:val="auto"/>
+                <w:kern w:val="0"/>
+                <w:sz w:val="24"/>
+                <w:szCs w:val="24"/>
+              </w:rPr>
+            </w:pPr>
+            <w:r>
+              <w:rPr>
+                <w:b/>
+                <w:bCs/>
+                <w:color w:val="auto"/>
+                <w:kern w:val="0"/>
+                <w:sz w:val="22"/>
+                <w:szCs w:val="24"/>
+              </w:rPr>
+              <w:t>:</w:t>
+            </w:r>
+            <w:r>
+              <w:rPr>
+                <w:color w:val="auto"/>
+                <w:kern w:val="0"/>
+                <w:sz w:val="22"/>
+                <w:szCs w:val="24"/>
+              </w:rPr>
+              <w:t>22</w:t>
+            </w:r>
+            <w:r>
+              <w:rPr>
+                <w:color w:val="auto"/>
+                <w:kern w:val="0"/>
+                <w:sz w:val="22"/>
+                <w:szCs w:val="24"/>
+              </w:rPr>
+              <w:t xml:space="preserve">/05/2026      </w:t>
+            </w:r>
+            <w:r>
+              <w:rPr>
+                <w:b/>
+                <w:color w:val="auto"/>
+                <w:kern w:val="0"/>
+                <w:sz w:val="22"/>
+                <w:szCs w:val="24"/>
+              </w:rPr>
+              <w:t>Meeting:</w:t>
+            </w:r>
+            <w:r>
+              <w:rPr>
+                <w:color w:val="auto"/>
+                <w:kern w:val="0"/>
+                <w:sz w:val="22"/>
+                <w:szCs w:val="24"/>
+              </w:rPr>
+              <w:t xml:space="preserve">  </w:t>
+            </w:r>
+            <w:r>
+              <w:rPr>
+                <w:color w:val="auto"/>
+                <w:kern w:val="0"/>
+                <w:sz w:val="24"/>
+                <w:szCs w:val="24"/>
+              </w:rPr>
+              <w:t xml:space="preserve">1 / 2 / 3 / </w:t>
+            </w:r>
+            <w:r>
+              <w:rPr>
+                <w:color w:val="auto"/>
+                <w:kern w:val="0"/>
+                <w:sz w:val="24"/>
+                <w:szCs w:val="24"/>
+              </w:rPr>
+              <w:t>4</w:t>
+            </w:r>
+            <w:r>
+              <w:rPr>
+                <w:color w:val="auto"/>
+                <w:kern w:val="0"/>
+                <w:sz w:val="24"/>
+                <w:szCs w:val="24"/>
+              </w:rPr>
+              <w:t xml:space="preserve"> / </w:t>
+            </w:r>
+            <w:r>
+              <w:rPr>
+                <w:color w:val="auto"/>
+                <w:kern w:val="0"/>
+                <w:sz w:val="24"/>
+                <w:szCs w:val="24"/>
+              </w:rPr>
+              <w:t>5</w:t>
+            </w:r>
+            <w:r>
+              <w:rPr>
+                <w:color w:val="auto"/>
+                <w:kern w:val="0"/>
+                <w:sz w:val="24"/>
+                <w:szCs w:val="24"/>
+              </w:rPr>
+              <w:t xml:space="preserve">/ </w:t>
+            </w:r>
+            <w:r>
+              <w:rPr>
+                <w:color w:val="auto"/>
+                <w:kern w:val="0"/>
+                <w:sz w:val="24"/>
+                <w:szCs w:val="24"/>
+              </w:rPr>
+              <w:t>6</w:t>
+            </w:r>
+            <w:r>
+              <w:rPr>
+                <w:color w:val="auto"/>
+                <w:kern w:val="0"/>
+                <w:sz w:val="24"/>
+                <w:szCs w:val="24"/>
+              </w:rPr>
+              <w:t xml:space="preserve"> / </w:t>
+            </w:r>
+            <w:r>
+              <w:rPr>
+                <w:color w:val="auto"/>
+                <w:kern w:val="0"/>
+                <w:sz w:val="24"/>
+                <w:szCs w:val="24"/>
+                <w:highlight w:val="yellow"/>
+              </w:rPr>
+              <w:t>7</w:t>
+            </w:r>
+            <w:r>
+              <w:rPr>
+                <w:color w:val="auto"/>
+                <w:kern w:val="0"/>
+                <w:sz w:val="24"/>
+                <w:szCs w:val="24"/>
+              </w:rPr>
+              <w:t xml:space="preserve"> ……</w:t>
+            </w:r>
+          </w:p>
+          <w:p>
+            <w:pPr>
+              <w:spacing w:after="0" w:line="360" w:lineRule="auto"/>
+              <w:jc w:val="both"/>
+              <w:rPr>
+                <w:color w:val="auto"/>
+                <w:kern w:val="0"/>
+                <w:sz w:val="22"/>
+                <w:szCs w:val="24"/>
+              </w:rPr>
+            </w:pPr>
+          </w:p>
+        </w:tc>
+      </w:tr>
+      <w:tr>
+        <w:tc>
+          <w:tcPr>
+            <w:tcW w:w="2072" w:type="dxa"/>
+          </w:tcPr>
+          <w:p>
+            <w:pPr>
+              <w:spacing w:after="0"/>
+              <w:rPr>
+                <w:b/>
+              </w:rPr>
+            </w:pPr>
+            <w:r>
+              <w:rPr>
+                <w:b/>
+              </w:rPr>
+              <w:t>Student</w:t>
+            </w:r>
+          </w:p>
+          <w:p>
+            <w:pPr>
+              <w:spacing w:after="0" w:line="240" w:lineRule="auto"/>
+              <w:jc w:val="both"/>
+              <w:rPr>
+                <w:b/>
+              </w:rPr>
+            </w:pPr>
+            <w:r>
+              <w:rPr>
+                <w:b/>
+              </w:rPr>
+              <w:t>(Meeting Minute/</w:t>
+            </w:r>
+          </w:p>
+          <w:p>
+            <w:pPr>
+              <w:spacing w:after="0" w:line="240" w:lineRule="auto"/>
+              <w:jc w:val="both"/>
+              <w:rPr>
+                <w:b/>
+              </w:rPr>
+            </w:pPr>
+            <w:r>
+              <w:rPr>
+                <w:b/>
+              </w:rPr>
+              <w:t>Achievements/</w:t>
+            </w:r>
+          </w:p>
+          <w:p>
+            <w:pPr>
+              <w:spacing w:after="0" w:line="240" w:lineRule="auto"/>
+              <w:jc w:val="both"/>
+              <w:rPr>
+                <w:color w:val="auto"/>
+                <w:kern w:val="0"/>
+                <w:sz w:val="22"/>
+                <w:szCs w:val="24"/>
+              </w:rPr>
+            </w:pPr>
+            <w:r>
+              <w:rPr>
+                <w:b/>
+              </w:rPr>
+              <w:t>Activities</w:t>
+            </w:r>
+            <w:r>
+              <w:rPr>
+                <w:b/>
+              </w:rPr>
+              <w:t>)</w:t>
+            </w:r>
+          </w:p>
+        </w:tc>
+        <w:tc>
+          <w:tcPr>
+            <w:tcW w:w="7666" w:type="dxa"/>
+          </w:tcPr>
+          <w:p>
+            <w:pPr>
+              <w:spacing w:after="0" w:line="360" w:lineRule="auto"/>
+              <w:rPr>
+                <w:color w:val="auto"/>
+                <w:kern w:val="0"/>
+                <w:sz w:val="22"/>
+                <w:szCs w:val="24"/>
+              </w:rPr>
+            </w:pPr>
+            <w:r>
+              <w:rPr>
+                <w:color w:val="auto"/>
+                <w:kern w:val="0"/>
+                <w:sz w:val="22"/>
+                <w:szCs w:val="24"/>
+              </w:rPr>
+              <w:t>Presented the completed Chapter 4 draft to supervisor. Completed the full system architecture design including three-tier AWS VPC with six subnets across two Availability Zones. Completed security group rules, NACL configuration, and IAM role definitions with least-privilege policies. Completed the DevSecOps pipeline design with six stages and blocking gates for Trivy, SonarQube, and Checkov. Completed the database schema with six tables and PostgreSQL row-level security policies for Doctor, Patient, and Admin roles. Completed the HIPAA Security Rule compliance mapping table. Completed interface wireframes for Login Screen, Doctor Dashboard, Admin Dashboard, and Patient Portal.</w:t>
+            </w:r>
+          </w:p>
+          <w:p>
+            <w:pPr>
+              <w:spacing w:after="0" w:line="360" w:lineRule="auto"/>
+              <w:rPr>
+                <w:color w:val="auto"/>
+                <w:kern w:val="0"/>
+                <w:sz w:val="22"/>
+                <w:szCs w:val="24"/>
+              </w:rPr>
+            </w:pPr>
+          </w:p>
+        </w:tc>
+      </w:tr>
+      <w:tr>
+        <w:tc>
+          <w:tcPr>
+            <w:tcW w:w="2072" w:type="dxa"/>
+          </w:tcPr>
+          <w:p>
+            <w:pPr>
+              <w:spacing w:after="0"/>
+              <w:rPr>
+                <w:b/>
+              </w:rPr>
+            </w:pPr>
+            <w:r>
+              <w:rPr>
+                <w:b/>
+              </w:rPr>
+              <w:t>Supervisor</w:t>
+            </w:r>
+          </w:p>
+          <w:p>
+            <w:pPr>
+              <w:spacing w:after="0" w:line="240" w:lineRule="auto"/>
+              <w:jc w:val="both"/>
+              <w:rPr>
+                <w:b/>
+                <w:color w:val="auto"/>
+                <w:kern w:val="0"/>
+                <w:sz w:val="22"/>
+                <w:szCs w:val="24"/>
+              </w:rPr>
+            </w:pPr>
+            <w:r>
+              <w:rPr>
+                <w:b/>
+              </w:rPr>
+              <w:t>(Suggestion&amp; Comments)</w:t>
+            </w:r>
+          </w:p>
+          <w:p>
+            <w:pPr>
+              <w:spacing w:after="0" w:line="360" w:lineRule="auto"/>
+              <w:jc w:val="both"/>
+              <w:rPr>
+                <w:color w:val="auto"/>
+                <w:kern w:val="0"/>
+                <w:sz w:val="22"/>
+                <w:szCs w:val="24"/>
+              </w:rPr>
+            </w:pPr>
+          </w:p>
+          <w:p>
+            <w:pPr>
+              <w:spacing w:after="0" w:line="360" w:lineRule="auto"/>
+              <w:jc w:val="both"/>
+              <w:rPr>
+                <w:color w:val="auto"/>
+                <w:kern w:val="0"/>
+                <w:sz w:val="22"/>
+                <w:szCs w:val="24"/>
+              </w:rPr>
+            </w:pPr>
+          </w:p>
+          <w:p>
+            <w:pPr>
+              <w:spacing w:after="0" w:line="360" w:lineRule="auto"/>
+              <w:jc w:val="both"/>
+              <w:rPr>
+                <w:color w:val="auto"/>
+                <w:kern w:val="0"/>
+                <w:sz w:val="22"/>
+                <w:szCs w:val="24"/>
+              </w:rPr>
+            </w:pPr>
+          </w:p>
+        </w:tc>
+        <w:tc>
+          <w:tcPr>
+            <w:tcW w:w="7666" w:type="dxa"/>
+          </w:tcPr>
+          <w:p>
+            <w:pPr>
+              <w:spacing w:after="0" w:line="360" w:lineRule="auto"/>
+              <w:jc w:val="both"/>
+            </w:pPr>
+            <w:r>
+              <w:rPr>
+                <w:color w:val="auto"/>
+                <w:kern w:val="0"/>
+                <w:sz w:val="22"/>
+                <w:szCs w:val="24"/>
+              </w:rPr>
+              <w:t xml:space="preserve">: </w:t>
+            </w:r>
+            <w:r>
+              <w:t>Overall design is comprehensive and well-documented. Suggested clarifying the distinction between Security Groups and NACLs in the text to highlight their complementary roles. Recommended ensuring the RLS policies are explicitly tied back to the HIPAA access control requirement in the compliance mapping table. Noted that the interface wireframes clearly demonstrate role segregation, which strengthens the system's security-by-design argument.</w:t>
+            </w:r>
+          </w:p>
+          <w:p>
+            <w:pPr>
+              <w:spacing w:after="0" w:line="360" w:lineRule="auto"/>
+              <w:jc w:val="both"/>
+            </w:pPr>
+          </w:p>
+        </w:tc>
+      </w:tr>
+      <w:tr>
+        <w:tc>
+          <w:tcPr>
+            <w:tcW w:w="2072" w:type="dxa"/>
+          </w:tcPr>
+          <w:p>
+            <w:pPr>
+              <w:spacing w:after="0" w:line="240" w:lineRule="auto"/>
+              <w:rPr>
+                <w:b/>
+              </w:rPr>
+            </w:pPr>
+            <w:r>
+              <w:rPr>
+                <w:b/>
+              </w:rPr>
+              <w:t>Next Meeting</w:t>
+            </w:r>
+          </w:p>
+          <w:p>
+            <w:pPr>
+              <w:spacing w:after="0" w:line="240" w:lineRule="auto"/>
+              <w:rPr>
+                <w:b/>
+              </w:rPr>
+            </w:pPr>
+            <w:r>
+              <w:rPr>
+                <w:b/>
+              </w:rPr>
+              <w:t>Plan</w:t>
+            </w:r>
+          </w:p>
+        </w:tc>
+        <w:tc>
+          <w:tcPr>
+            <w:tcW w:w="7666" w:type="dxa"/>
+          </w:tcPr>
+          <w:p>
+            <w:pPr>
+              <w:spacing w:after="0" w:line="360" w:lineRule="auto"/>
+              <w:rPr>
+                <w:color w:val="auto"/>
+                <w:kern w:val="0"/>
+                <w:sz w:val="22"/>
+                <w:szCs w:val="24"/>
+              </w:rPr>
+            </w:pPr>
+            <w:r>
+              <w:rPr>
+                <w:color w:val="auto"/>
+                <w:kern w:val="0"/>
+                <w:sz w:val="22"/>
+                <w:szCs w:val="24"/>
+              </w:rPr>
+              <w:t xml:space="preserve">: </w:t>
+            </w:r>
+            <w:r>
+              <w:t>discuss any corrections</w:t>
+            </w:r>
+          </w:p>
+        </w:tc>
+      </w:tr>
+      <w:tr>
+        <w:tc>
+          <w:tcPr>
+            <w:tcW w:w="2072" w:type="dxa"/>
+          </w:tcPr>
+          <w:p>
+            <w:pPr>
+              <w:spacing w:after="0" w:line="240" w:lineRule="auto"/>
+              <w:jc w:val="both"/>
+              <w:rPr>
+                <w:b/>
+                <w:color w:val="auto"/>
+                <w:kern w:val="0"/>
+                <w:sz w:val="22"/>
+                <w:szCs w:val="24"/>
+              </w:rPr>
+            </w:pPr>
+          </w:p>
+          <w:p>
+            <w:pPr>
+              <w:spacing w:after="0" w:line="240" w:lineRule="auto"/>
+              <w:jc w:val="both"/>
+            </w:pPr>
+            <w:r>
+              <w:rPr>
+                <w:b/>
+                <w:color w:val="auto"/>
+                <w:kern w:val="0"/>
+                <w:sz w:val="22"/>
+                <w:szCs w:val="24"/>
+              </w:rPr>
+              <w:t>Supervisor’s Signature</w:t>
+            </w:r>
+          </w:p>
+        </w:tc>
+        <w:tc>
+          <w:tcPr>
+            <w:tcW w:w="7666" w:type="dxa"/>
+          </w:tcPr>
+          <w:p>
+            <w:pPr>
+              <w:spacing w:after="0" w:line="360" w:lineRule="auto"/>
+              <w:jc w:val="both"/>
+              <w:rPr>
+                <w:color w:val="auto"/>
+                <w:kern w:val="0"/>
+                <w:sz w:val="22"/>
+                <w:szCs w:val="24"/>
+              </w:rPr>
+            </w:pPr>
+          </w:p>
+          <w:p>
+            <w:pPr>
+              <w:spacing w:after="0" w:line="360" w:lineRule="auto"/>
+              <w:jc w:val="both"/>
+              <w:rPr>
+                <w:color w:val="auto"/>
+                <w:kern w:val="0"/>
+                <w:sz w:val="22"/>
+                <w:szCs w:val="24"/>
+              </w:rPr>
+            </w:pPr>
+          </w:p>
+          <w:p>
+            <w:pPr>
+              <w:spacing w:after="0" w:line="360" w:lineRule="auto"/>
+              <w:jc w:val="both"/>
+              <w:rPr>
+                <w:color w:val="auto"/>
+                <w:kern w:val="0"/>
+                <w:sz w:val="22"/>
+                <w:szCs w:val="24"/>
+              </w:rPr>
+            </w:pPr>
+            <w:r>
+              <w:rPr>
+                <w:color w:val="auto"/>
+                <w:kern w:val="0"/>
+                <w:sz w:val="22"/>
+                <w:szCs w:val="24"/>
+              </w:rPr>
+              <w:t>……………………….     Date: …………………</w:t>
+            </w:r>
+          </w:p>
+        </w:tc>
+      </w:tr>
+    </w:tbl>
+    <w:p/>
+    <w:p/>
     <w:p/>
     <w:p/>
     <w:sectPr>
@@ -8370,7 +10169,7 @@
   <w:style w:type="paragraph" w:default="1" w:styleId="Normal">
     <w:name w:val="Normal"/>
     <w:qFormat/>
-    <w:rsid w:val="00E20957"/>
+    <w:rsid w:val="00250A42"/>
     <w:pPr>
       <w:spacing w:after="180" w:line="271" w:lineRule="auto"/>
     </w:pPr>

</xml_diff>